<commit_message>
Updated the Data Input section of POST_APIs.docx.
</commit_message>
<xml_diff>
--- a/Portal_Database_Design/Post_APIs.docx
+++ b/Portal_Database_Design/Post_APIs.docx
@@ -349,7 +349,7 @@
             </w:pPr>
             <w:r>
               <w:rPr/>
-              <w:t>All POST fields + user_id in request body.</w:t>
+              <w:t>createPostDto</w:t>
             </w:r>
           </w:p>
         </w:tc>
@@ -453,7 +453,11 @@
             </w:pPr>
             <w:r>
               <w:rPr/>
-              <w:t>post_title.</w:t>
+              <w:t>post_</w:t>
+            </w:r>
+            <w:r>
+              <w:rPr/>
+              <w:t>id, updatePostTitleDto</w:t>
             </w:r>
           </w:p>
         </w:tc>
@@ -557,7 +561,11 @@
             </w:pPr>
             <w:r>
               <w:rPr/>
-              <w:t>post_content.</w:t>
+              <w:t>post_</w:t>
+            </w:r>
+            <w:r>
+              <w:rPr/>
+              <w:t>id, updatePostContentDto</w:t>
             </w:r>
           </w:p>
         </w:tc>
@@ -661,7 +669,11 @@
             </w:pPr>
             <w:r>
               <w:rPr/>
-              <w:t>post_status in request body.</w:t>
+              <w:t>post_</w:t>
+            </w:r>
+            <w:r>
+              <w:rPr/>
+              <w:t>id, updatePostStatusDto</w:t>
             </w:r>
           </w:p>
         </w:tc>
@@ -765,7 +777,7 @@
             </w:pPr>
             <w:r>
               <w:rPr/>
-              <w:t>post_id in URL param.</w:t>
+              <w:t>post_id</w:t>
             </w:r>
           </w:p>
         </w:tc>
@@ -973,7 +985,7 @@
             </w:pPr>
             <w:r>
               <w:rPr/>
-              <w:t>post_title in request body.</w:t>
+              <w:t>searchPostTitleDto</w:t>
             </w:r>
           </w:p>
         </w:tc>
@@ -1081,7 +1093,7 @@
             </w:pPr>
             <w:r>
               <w:rPr/>
-              <w:t>post_id in URL params.</w:t>
+              <w:t>post_id</w:t>
             </w:r>
           </w:p>
         </w:tc>
@@ -1426,9 +1438,6 @@
           <w:bCs/>
         </w:rPr>
       </w:pPr>
-      <w:bookmarkStart w:id="3" w:name="__DdeLink__194_3029720114"/>
-      <w:bookmarkStart w:id="4" w:name="__DdeLink__190_3029720114"/>
-      <w:bookmarkStart w:id="5" w:name="__DdeLink__187_3029720114"/>
       <w:r>
         <w:rPr>
           <w:b/>
@@ -1444,16 +1453,16 @@
         <w:jc w:val="both"/>
         <w:rPr/>
       </w:pPr>
-      <w:bookmarkStart w:id="6" w:name="__DdeLink__194_3029720114"/>
-      <w:bookmarkStart w:id="7" w:name="__DdeLink__190_3029720114"/>
-      <w:bookmarkStart w:id="8" w:name="__DdeLink__187_3029720114"/>
+      <w:bookmarkStart w:id="3" w:name="__DdeLink__187_3029720114"/>
+      <w:bookmarkStart w:id="4" w:name="__DdeLink__190_3029720114"/>
+      <w:bookmarkStart w:id="5" w:name="__DdeLink__194_3029720114"/>
       <w:r>
         <w:rPr/>
         <w:t>Perform tests on mostly on Domain Integrity and Entity integrity with just very few tests on Referential Integrity.</w:t>
       </w:r>
-      <w:bookmarkEnd w:id="6"/>
-      <w:bookmarkEnd w:id="7"/>
-      <w:bookmarkEnd w:id="8"/>
+      <w:bookmarkEnd w:id="3"/>
+      <w:bookmarkEnd w:id="4"/>
+      <w:bookmarkEnd w:id="5"/>
     </w:p>
     <w:p>
       <w:pPr>
@@ -1501,7 +1510,7 @@
         </w:rPr>
         <w:t xml:space="preserve">* </w:t>
       </w:r>
-      <w:bookmarkStart w:id="9" w:name="__DdeLink__382_481068113"/>
+      <w:bookmarkStart w:id="6" w:name="__DdeLink__382_481068113"/>
       <w:r>
         <w:rPr>
           <w:b w:val="false"/>
@@ -1509,7 +1518,7 @@
         </w:rPr>
         <w:t xml:space="preserve">Create a POST with the following details ( </w:t>
       </w:r>
-      <w:bookmarkStart w:id="10" w:name="__DdeLink__386_481068113"/>
+      <w:bookmarkStart w:id="7" w:name="__DdeLink__386_481068113"/>
       <w:r>
         <w:rPr>
           <w:b w:val="false"/>
@@ -1517,177 +1526,177 @@
         </w:rPr>
         <w:t>post_content, user_id, post_status</w:t>
       </w:r>
+      <w:bookmarkEnd w:id="7"/>
+      <w:r>
+        <w:rPr>
+          <w:b w:val="false"/>
+          <w:bCs w:val="false"/>
+        </w:rPr>
+        <w:t>) (</w:t>
+      </w:r>
+      <w:bookmarkStart w:id="8" w:name="__DdeLink__388_481068113"/>
+      <w:r>
+        <w:rPr>
+          <w:b w:val="false"/>
+          <w:bCs w:val="false"/>
+        </w:rPr>
+        <w:t>“</w:t>
+      </w:r>
+      <w:bookmarkStart w:id="9" w:name="__DdeLink__390_481068113"/>
+      <w:r>
+        <w:rPr>
+          <w:b w:val="false"/>
+          <w:bCs w:val="false"/>
+        </w:rPr>
+        <w:t>Test Post 2 for user JULF”,  9, open</w:t>
+      </w:r>
+      <w:bookmarkEnd w:id="8"/>
+      <w:r>
+        <w:rPr>
+          <w:b w:val="false"/>
+          <w:bCs w:val="false"/>
+        </w:rPr>
+        <w:t>)</w:t>
+      </w:r>
+      <w:bookmarkEnd w:id="9"/>
+      <w:r>
+        <w:rPr>
+          <w:b w:val="false"/>
+          <w:bCs w:val="false"/>
+        </w:rPr>
+        <w:t>. Here, we are trying to test if duplicate post_content is allowed.</w:t>
+      </w:r>
+      <w:bookmarkEnd w:id="6"/>
+      <w:r>
+        <w:rPr>
+          <w:b w:val="false"/>
+          <w:bCs w:val="false"/>
+        </w:rPr>
+        <w:t xml:space="preserve"> </w:t>
+      </w:r>
+      <w:bookmarkStart w:id="10" w:name="__DdeLink__384_481068113"/>
+      <w:r>
+        <w:rPr>
+          <w:b w:val="false"/>
+          <w:bCs w:val="false"/>
+        </w:rPr>
+        <w:t>This tests whether a UNIQUE constraint exists for the post_content column</w:t>
+      </w:r>
       <w:bookmarkEnd w:id="10"/>
       <w:r>
         <w:rPr>
           <w:b w:val="false"/>
           <w:bCs w:val="false"/>
         </w:rPr>
-        <w:t>) (</w:t>
-      </w:r>
-      <w:bookmarkStart w:id="11" w:name="__DdeLink__388_481068113"/>
-      <w:r>
-        <w:rPr>
-          <w:b w:val="false"/>
-          <w:bCs w:val="false"/>
-        </w:rPr>
-        <w:t>“</w:t>
-      </w:r>
-      <w:bookmarkStart w:id="12" w:name="__DdeLink__390_481068113"/>
-      <w:r>
-        <w:rPr>
-          <w:b w:val="false"/>
-          <w:bCs w:val="false"/>
-        </w:rPr>
-        <w:t>Test Post 2 for user JULF”,  9, open</w:t>
+        <w:t xml:space="preserve">. </w:t>
+      </w:r>
+    </w:p>
+    <w:p>
+      <w:pPr>
+        <w:pStyle w:val="Normal"/>
+        <w:bidi w:val="0"/>
+        <w:jc w:val="both"/>
+        <w:rPr>
+          <w:b w:val="false"/>
+          <w:bCs w:val="false"/>
+        </w:rPr>
+      </w:pPr>
+      <w:r>
+        <w:rPr>
+          <w:b w:val="false"/>
+          <w:bCs w:val="false"/>
+        </w:rPr>
+      </w:r>
+    </w:p>
+    <w:p>
+      <w:pPr>
+        <w:pStyle w:val="Normal"/>
+        <w:bidi w:val="0"/>
+        <w:jc w:val="both"/>
+        <w:rPr>
+          <w:b w:val="false"/>
+          <w:bCs w:val="false"/>
+        </w:rPr>
+      </w:pPr>
+      <w:r>
+        <w:rPr>
+          <w:b w:val="false"/>
+          <w:bCs w:val="false"/>
+        </w:rPr>
+        <w:t>* Create a POST with the following details ( post_content, post_title, user_id, post_status) (“Some Test Post Content”, “JULF Test Post 2”, 9, open). Here, we are trying to test if duplicate post_title is allowed.  This tests whether a UNIQUE constraint exists for the post_title column.</w:t>
+      </w:r>
+    </w:p>
+    <w:p>
+      <w:pPr>
+        <w:pStyle w:val="Normal"/>
+        <w:bidi w:val="0"/>
+        <w:jc w:val="both"/>
+        <w:rPr>
+          <w:b w:val="false"/>
+          <w:bCs w:val="false"/>
+        </w:rPr>
+      </w:pPr>
+      <w:r>
+        <w:rPr>
+          <w:b w:val="false"/>
+          <w:bCs w:val="false"/>
+        </w:rPr>
+      </w:r>
+    </w:p>
+    <w:p>
+      <w:pPr>
+        <w:pStyle w:val="Normal"/>
+        <w:bidi w:val="0"/>
+        <w:jc w:val="both"/>
+        <w:rPr>
+          <w:b w:val="false"/>
+          <w:bCs w:val="false"/>
+        </w:rPr>
+      </w:pPr>
+      <w:r>
+        <w:rPr>
+          <w:b w:val="false"/>
+          <w:bCs w:val="false"/>
+        </w:rPr>
+        <w:t>* Delete the POST with post_title “JULF Test Post 2” and post_content “Test Post 2 for user JULF”. This will tell us what happens to the corresponding user when this post is deleted. Here, we are checking referential integrity w.r.t user_id.</w:t>
+      </w:r>
+    </w:p>
+    <w:p>
+      <w:pPr>
+        <w:pStyle w:val="Normal"/>
+        <w:bidi w:val="0"/>
+        <w:jc w:val="both"/>
+        <w:rPr>
+          <w:b w:val="false"/>
+          <w:bCs w:val="false"/>
+        </w:rPr>
+      </w:pPr>
+      <w:r>
+        <w:rPr>
+          <w:b w:val="false"/>
+          <w:bCs w:val="false"/>
+        </w:rPr>
+      </w:r>
+    </w:p>
+    <w:p>
+      <w:pPr>
+        <w:pStyle w:val="Normal"/>
+        <w:bidi w:val="0"/>
+        <w:jc w:val="both"/>
+        <w:rPr>
+          <w:b w:val="false"/>
+          <w:bCs w:val="false"/>
+        </w:rPr>
+      </w:pPr>
+      <w:bookmarkStart w:id="11" w:name="__DdeLink__397_481068113"/>
+      <w:r>
+        <w:rPr>
+          <w:b w:val="false"/>
+          <w:bCs w:val="false"/>
+        </w:rPr>
+        <w:t>* Create a POST with the following details (post_content, post_title, user_id, post_status) (Test Post 2 for user JULF”, “JULF Test Post 2”  9, open). We are doing this test, so that the deleted post is re-created. This way, we can run these tests repeatedly.</w:t>
       </w:r>
       <w:bookmarkEnd w:id="11"/>
-      <w:r>
-        <w:rPr>
-          <w:b w:val="false"/>
-          <w:bCs w:val="false"/>
-        </w:rPr>
-        <w:t>)</w:t>
-      </w:r>
-      <w:bookmarkEnd w:id="12"/>
-      <w:r>
-        <w:rPr>
-          <w:b w:val="false"/>
-          <w:bCs w:val="false"/>
-        </w:rPr>
-        <w:t>. Here, we are trying to test if duplicate post_content is allowed.</w:t>
-      </w:r>
-      <w:bookmarkEnd w:id="9"/>
-      <w:r>
-        <w:rPr>
-          <w:b w:val="false"/>
-          <w:bCs w:val="false"/>
-        </w:rPr>
-        <w:t xml:space="preserve"> </w:t>
-      </w:r>
-      <w:bookmarkStart w:id="13" w:name="__DdeLink__384_481068113"/>
-      <w:r>
-        <w:rPr>
-          <w:b w:val="false"/>
-          <w:bCs w:val="false"/>
-        </w:rPr>
-        <w:t>This tests whether a UNIQUE constraint exists for the post_content column</w:t>
-      </w:r>
-      <w:bookmarkEnd w:id="13"/>
-      <w:r>
-        <w:rPr>
-          <w:b w:val="false"/>
-          <w:bCs w:val="false"/>
-        </w:rPr>
-        <w:t xml:space="preserve">. </w:t>
-      </w:r>
-    </w:p>
-    <w:p>
-      <w:pPr>
-        <w:pStyle w:val="Normal"/>
-        <w:bidi w:val="0"/>
-        <w:jc w:val="both"/>
-        <w:rPr>
-          <w:b w:val="false"/>
-          <w:bCs w:val="false"/>
-        </w:rPr>
-      </w:pPr>
-      <w:r>
-        <w:rPr>
-          <w:b w:val="false"/>
-          <w:bCs w:val="false"/>
-        </w:rPr>
-      </w:r>
-    </w:p>
-    <w:p>
-      <w:pPr>
-        <w:pStyle w:val="Normal"/>
-        <w:bidi w:val="0"/>
-        <w:jc w:val="both"/>
-        <w:rPr>
-          <w:b w:val="false"/>
-          <w:bCs w:val="false"/>
-        </w:rPr>
-      </w:pPr>
-      <w:r>
-        <w:rPr>
-          <w:b w:val="false"/>
-          <w:bCs w:val="false"/>
-        </w:rPr>
-        <w:t>* Create a POST with the following details ( post_content, post_title, user_id, post_status) (“Some Test Post Content”, “JULF Test Post 2”, 9, open). Here, we are trying to test if duplicate post_title is allowed.  This tests whether a UNIQUE constraint exists for the post_title column.</w:t>
-      </w:r>
-    </w:p>
-    <w:p>
-      <w:pPr>
-        <w:pStyle w:val="Normal"/>
-        <w:bidi w:val="0"/>
-        <w:jc w:val="both"/>
-        <w:rPr>
-          <w:b w:val="false"/>
-          <w:bCs w:val="false"/>
-        </w:rPr>
-      </w:pPr>
-      <w:r>
-        <w:rPr>
-          <w:b w:val="false"/>
-          <w:bCs w:val="false"/>
-        </w:rPr>
-      </w:r>
-    </w:p>
-    <w:p>
-      <w:pPr>
-        <w:pStyle w:val="Normal"/>
-        <w:bidi w:val="0"/>
-        <w:jc w:val="both"/>
-        <w:rPr>
-          <w:b w:val="false"/>
-          <w:bCs w:val="false"/>
-        </w:rPr>
-      </w:pPr>
-      <w:r>
-        <w:rPr>
-          <w:b w:val="false"/>
-          <w:bCs w:val="false"/>
-        </w:rPr>
-        <w:t>* Delete the POST with post_title “JULF Test Post 2” and post_content “Test Post 2 for user JULF”. This will tell us what happens to the corresponding user when this post is deleted. Here, we are checking referential integrity w.r.t user_id.</w:t>
-      </w:r>
-    </w:p>
-    <w:p>
-      <w:pPr>
-        <w:pStyle w:val="Normal"/>
-        <w:bidi w:val="0"/>
-        <w:jc w:val="both"/>
-        <w:rPr>
-          <w:b w:val="false"/>
-          <w:bCs w:val="false"/>
-        </w:rPr>
-      </w:pPr>
-      <w:r>
-        <w:rPr>
-          <w:b w:val="false"/>
-          <w:bCs w:val="false"/>
-        </w:rPr>
-      </w:r>
-    </w:p>
-    <w:p>
-      <w:pPr>
-        <w:pStyle w:val="Normal"/>
-        <w:bidi w:val="0"/>
-        <w:jc w:val="both"/>
-        <w:rPr>
-          <w:b w:val="false"/>
-          <w:bCs w:val="false"/>
-        </w:rPr>
-      </w:pPr>
-      <w:bookmarkStart w:id="14" w:name="__DdeLink__397_481068113"/>
-      <w:r>
-        <w:rPr>
-          <w:b w:val="false"/>
-          <w:bCs w:val="false"/>
-        </w:rPr>
-        <w:t>* Create a POST with the following details (post_content, post_title, user_id, post_status) (Test Post 2 for user JULF”, “JULF Test Post 2”  9, open). We are doing this test, so that the deleted post is re-created. This way, we can run these tests repeatedly.</w:t>
-      </w:r>
-      <w:bookmarkEnd w:id="14"/>
     </w:p>
     <w:sectPr>
       <w:type w:val="nextPage"/>

</xml_diff>